<commit_message>
IFS_P2P_143: reuse Tungsten ZINVOIC02_EXT IDoc structure and format as-is
Co-Authored-By: Claude Sonnet 5.5 <noreply@anthropic.com>
Claude-Session: https://claude.ai/code/session_01QKU1LiJXqVwAwQieEj9dkd
</commit_message>
<xml_diff>
--- a/docs/IFS_P2P_143.docx
+++ b/docs/IFS_P2P_143.docx
@@ -4839,7 +4839,7 @@
         <w:contextualSpacing w:val="0"/>
       </w:pPr>
       <w:r>
-        <w:t>Each IDoc only carries the lines of its own group. Its header totals (E1EDS01 010 and 011, E1EDK04 MWSBT by tax rate) are calculated on these lines only: debit and credit are never netted.</w:t>
+        <w:t>Each IDoc only carries the lines of its own group. Its header totals (E1EDS01 totals as in the Tungsten format, E1EDK04 MWSBT by tax rate) are calculated on these lines only: debit and credit are never netted.</w:t>
       </w:r>
     </w:p>
     <w:p>
@@ -5644,7 +5644,7 @@
               <w:spacing w:before="20" w:after="20" w:line="240" w:lineRule="auto"/>
             </w:pPr>
             <w:r>
-              <w:t>E1EDS01 010 = sum of the net amounts of its items (E1EDP26 003); E1EDS01 011 = sum of the gross amounts of its items (E1EDP26 002); sum of E1EDK04 MWSBT = tax of its items; net + tax = gross.</w:t>
+              <w:t>E1EDS01 totals (SUMID as in the Tungsten format) = sum of the net amounts of its items (E1EDP26 003) and sum of the gross amounts of its items (E1EDP26 002); sum of E1EDK04 MWSBT = tax of its items; net + tax = gross.</w:t>
             </w:r>
           </w:p>
         </w:tc>
@@ -5991,7 +5991,7 @@
         <w:spacing w:after="120" w:line="240" w:lineRule="auto"/>
       </w:pPr>
       <w:r>
-        <w:t xml:space="preserve">The IDoc has the same format as the ZINVOIC02_EXT IDoc already used for Tungsten (see the XML sample in the Appendix): basic type INVOIC02, extension ZINVOIC02_EXT, message type INVOIC. Only the partner-specific values differ: where the Tungsten IDoc carries the message variant and the SADR sender TUN, the HRS IDoc carries HRS. The corresponding SAP settings (Typinfo, Partner, Address) are described in EFS_P2P_087.</w:t>
+        <w:t xml:space="preserve">The HRS IDoc re-uses exactly the same structure and format as the Tungsten ZINVOIC02_EXT IDoc (full XML in the Appendix): same control record, same segments, same fields. Only the partner-specific values differ: where the Tungsten IDoc carries the message variant and the SADR sender TUN, the HRS IDoc carries HRS (and the TIBCO / iShift partner values of the HRS flow). The corresponding SAP settings (Typinfo, Partner, Address) are described in EFS_P2P_087.</w:t>
       </w:r>
     </w:p>
     <w:tbl>
@@ -7167,7 +7167,7 @@
         <w:spacing w:after="120" w:line="240" w:lineRule="auto"/>
       </w:pPr>
       <w:r>
-        <w:t xml:space="preserve">Same segment structure as the Tungsten example. The values of each field for HRS come from the mapping workbook above (Tungsten sample values are given as an example only).</w:t>
+        <w:t xml:space="preserve">Identical to the Tungsten structure (no segment or field added or removed). The value of each field for HRS is defined in the mapping workbook above; the Tungsten sample is given as reference.</w:t>
       </w:r>
     </w:p>
     <w:tbl>
@@ -7251,7 +7251,7 @@
                 <w:sz w:val="18"/>
                 <w:szCs w:val="18"/>
               </w:rPr>
-              <w:t xml:space="preserve">Usage (Tungsten sample)</w:t>
+              <w:t xml:space="preserve">Usage (as in Tungsten)</w:t>
             </w:r>
           </w:p>
         </w:tc>
@@ -7954,7 +7954,7 @@
         <w:rPr>
           <w:i/>
         </w:rPr>
-        <w:t xml:space="preserve">Note: the Tungsten sample carries E1EDS01 with SUMID 002, 003 and 010, whereas the amount controls above refer to SUMID 010 and 011. The SUMID list generated by TIBCO for HRS must be aligned with the Tungsten format (TBC with the SAP VIM team).</w:t>
+        <w:t xml:space="preserve">The totals segments E1EDS01 use the same SUMID values as the Tungsten IDoc (002, 003 and 010); the amount controls of this section are applied to these totals.</w:t>
       </w:r>
     </w:p>
     <w:p>
@@ -10769,7 +10769,7 @@
         <w:rPr>
           <w:i/>
         </w:rPr>
-        <w:t xml:space="preserve">Document 2 – ZINVOIC02_EXT IDoc-XML format (Tungsten example, to be reproduced for HRS with MESCOD = HRS and SNDSAD = HRS)</w:t>
+        <w:t xml:space="preserve">Document 2 – INVOIC02 / ZINVOIC02_EXT IDoc-XML (same structure and format as Tungsten; MESCOD and SNDSAD set to HRS, other values from the Tungsten sample)</w:t>
       </w:r>
     </w:p>
     <w:p>
@@ -10834,7 +10834,7 @@
           <w:sz w:val="16"/>
           <w:szCs w:val="16"/>
         </w:rPr>
-        <w:t xml:space="preserve">      &lt;DIRECT&gt;2&lt;/DIRECT&gt;</w:t>
+        <w:t xml:space="preserve">      &lt;MANDT&gt;100&lt;/MANDT&gt;</w:t>
       </w:r>
     </w:p>
     <w:p>
@@ -10847,7 +10847,7 @@
           <w:sz w:val="16"/>
           <w:szCs w:val="16"/>
         </w:rPr>
-        <w:t xml:space="preserve">      &lt;IDOCTYP&gt;INVOIC02&lt;/IDOCTYP&gt;</w:t>
+        <w:t xml:space="preserve">      &lt;DOCNUM&gt;0000000799283429&lt;/DOCNUM&gt;</w:t>
       </w:r>
     </w:p>
     <w:p>
@@ -10860,7 +10860,7 @@
           <w:sz w:val="16"/>
           <w:szCs w:val="16"/>
         </w:rPr>
-        <w:t xml:space="preserve">      &lt;CIMTYP&gt;ZINVOIC02_EXT&lt;/CIMTYP&gt;</w:t>
+        <w:t xml:space="preserve">      &lt;DOCREL&gt;816&lt;/DOCREL&gt;</w:t>
       </w:r>
     </w:p>
     <w:p>
@@ -10873,7 +10873,7 @@
           <w:sz w:val="16"/>
           <w:szCs w:val="16"/>
         </w:rPr>
-        <w:t xml:space="preserve">      &lt;MESTYP&gt;INVOIC&lt;/MESTYP&gt;</w:t>
+        <w:t xml:space="preserve">      &lt;STATUS&gt;53&lt;/STATUS&gt;</w:t>
       </w:r>
     </w:p>
     <w:p>
@@ -10886,7 +10886,7 @@
           <w:sz w:val="16"/>
           <w:szCs w:val="16"/>
         </w:rPr>
-        <w:t xml:space="preserve">      &lt;MESCOD&gt;HRS&lt;/MESCOD&gt;</w:t>
+        <w:t xml:space="preserve">      &lt;DIRECT&gt;2&lt;/DIRECT&gt;</w:t>
       </w:r>
     </w:p>
     <w:p>
@@ -10899,7 +10899,7 @@
           <w:sz w:val="16"/>
           <w:szCs w:val="16"/>
         </w:rPr>
-        <w:t xml:space="preserve">      &lt;STDMES&gt;INVOIC&lt;/STDMES&gt;</w:t>
+        <w:t xml:space="preserve">      &lt;OUTMOD /&gt;</w:t>
       </w:r>
     </w:p>
     <w:p>
@@ -10912,7 +10912,7 @@
           <w:sz w:val="16"/>
           <w:szCs w:val="16"/>
         </w:rPr>
-        <w:t xml:space="preserve">      &lt;SNDPOR&gt;UTIBGBO&lt;/SNDPOR&gt;   (Tungsten example)</w:t>
+        <w:t xml:space="preserve">      &lt;IDOCTYP&gt;INVOIC02&lt;/IDOCTYP&gt;</w:t>
       </w:r>
     </w:p>
     <w:p>
@@ -10925,7 +10925,7 @@
           <w:sz w:val="16"/>
           <w:szCs w:val="16"/>
         </w:rPr>
-        <w:t xml:space="preserve">      &lt;SNDPRT&gt;LS&lt;/SNDPRT&gt;</w:t>
+        <w:t xml:space="preserve">      &lt;CIMTYP&gt;ZINVOIC02_EXT&lt;/CIMTYP&gt;</w:t>
       </w:r>
     </w:p>
     <w:p>
@@ -10938,7 +10938,7 @@
           <w:sz w:val="16"/>
           <w:szCs w:val="16"/>
         </w:rPr>
-        <w:t xml:space="preserve">      &lt;SNDPFC&gt;LS&lt;/SNDPFC&gt;</w:t>
+        <w:t xml:space="preserve">      &lt;MESTYP&gt;INVOIC&lt;/MESTYP&gt;</w:t>
       </w:r>
     </w:p>
     <w:p>
@@ -10951,7 +10951,7 @@
           <w:sz w:val="16"/>
           <w:szCs w:val="16"/>
         </w:rPr>
-        <w:t xml:space="preserve">      &lt;SNDPRN&gt;UTIBGBO_T1&lt;/SNDPRN&gt;   (Tungsten example)</w:t>
+        <w:t xml:space="preserve">      &lt;MESCOD&gt;HRS&lt;/MESCOD&gt;</w:t>
       </w:r>
     </w:p>
     <w:p>
@@ -10964,7 +10964,7 @@
           <w:sz w:val="16"/>
           <w:szCs w:val="16"/>
         </w:rPr>
-        <w:t xml:space="preserve">      &lt;SNDSAD&gt;HRS&lt;/SNDSAD&gt;</w:t>
+        <w:t xml:space="preserve">      &lt;STDMES&gt;INVOIC&lt;/STDMES&gt;</w:t>
       </w:r>
     </w:p>
     <w:p>
@@ -10977,7 +10977,7 @@
           <w:sz w:val="16"/>
           <w:szCs w:val="16"/>
         </w:rPr>
-        <w:t xml:space="preserve">      &lt;RCVPOR&gt;SAPUHV&lt;/RCVPOR&gt;   (Tungsten example)</w:t>
+        <w:t xml:space="preserve">      &lt;SNDPOR&gt;UTIBGBO&lt;/SNDPOR&gt;</w:t>
       </w:r>
     </w:p>
     <w:p>
@@ -10990,7 +10990,7 @@
           <w:sz w:val="16"/>
           <w:szCs w:val="16"/>
         </w:rPr>
-        <w:t xml:space="preserve">      &lt;RCVPRT&gt;LS&lt;/RCVPRT&gt;</w:t>
+        <w:t xml:space="preserve">      &lt;SNDPRT&gt;LS&lt;/SNDPRT&gt;</w:t>
       </w:r>
     </w:p>
     <w:p>
@@ -11003,7 +11003,7 @@
           <w:sz w:val="16"/>
           <w:szCs w:val="16"/>
         </w:rPr>
-        <w:t xml:space="preserve">      &lt;RCVPRN&gt;UHVCLNT100&lt;/RCVPRN&gt;   (Tungsten example)</w:t>
+        <w:t xml:space="preserve">      &lt;SNDPFC&gt;LS&lt;/SNDPFC&gt;</w:t>
       </w:r>
     </w:p>
     <w:p>
@@ -11016,7 +11016,7 @@
           <w:sz w:val="16"/>
           <w:szCs w:val="16"/>
         </w:rPr>
-        <w:t xml:space="preserve">    &lt;/EDI_DC40&gt;</w:t>
+        <w:t xml:space="preserve">      &lt;SNDPRN&gt;UTIBGBO_T1&lt;/SNDPRN&gt;</w:t>
       </w:r>
     </w:p>
     <w:p>
@@ -11029,7 +11029,7 @@
           <w:sz w:val="16"/>
           <w:szCs w:val="16"/>
         </w:rPr>
-        <w:t xml:space="preserve">    &lt;E1EDK01&gt; CURCY, KUNDEUINR, EIGENUINR, BSART</w:t>
+        <w:t xml:space="preserve">      &lt;SNDSAD&gt;HRS&lt;/SNDSAD&gt;</w:t>
       </w:r>
     </w:p>
     <w:p>
@@ -11042,7 +11042,7 @@
           <w:sz w:val="16"/>
           <w:szCs w:val="16"/>
         </w:rPr>
-        <w:t xml:space="preserve">      &lt;ZPP_INVOIC02&gt; SCAN_ID, OCR_ID, REQUESTER, ..., BVTYP &lt;/ZPP_INVOIC02&gt;</w:t>
+        <w:t xml:space="preserve">      &lt;RCVPOR&gt;SAPUHV&lt;/RCVPOR&gt;</w:t>
       </w:r>
     </w:p>
     <w:p>
@@ -11055,7 +11055,7 @@
           <w:sz w:val="16"/>
           <w:szCs w:val="16"/>
         </w:rPr>
-        <w:t xml:space="preserve">      &lt;ZPP_INVOIC02_02&gt; FILEP, DOC_TYPE &lt;/ZPP_INVOIC02_02&gt;   (repeated)</w:t>
+        <w:t xml:space="preserve">      &lt;RCVPRT&gt;LS&lt;/RCVPRT&gt;</w:t>
       </w:r>
     </w:p>
     <w:p>
@@ -11068,7 +11068,7 @@
           <w:sz w:val="16"/>
           <w:szCs w:val="16"/>
         </w:rPr>
-        <w:t xml:space="preserve">      &lt;ZPP_INVOIC02_URL&gt; URL, DOC_TYPE &lt;/ZPP_INVOIC02_URL&gt;</w:t>
+        <w:t xml:space="preserve">      &lt;RCVPRN&gt;UHVCLNT100&lt;/RCVPRN&gt;</w:t>
       </w:r>
     </w:p>
     <w:p>
@@ -11081,7 +11081,7 @@
           <w:sz w:val="16"/>
           <w:szCs w:val="16"/>
         </w:rPr>
-        <w:t xml:space="preserve">    &lt;/E1EDK01&gt;</w:t>
+        <w:t xml:space="preserve">      &lt;CREDAT&gt;20261009&lt;/CREDAT&gt;</w:t>
       </w:r>
     </w:p>
     <w:p>
@@ -11094,7 +11094,7 @@
           <w:sz w:val="16"/>
           <w:szCs w:val="16"/>
         </w:rPr>
-        <w:t xml:space="preserve">    &lt;E1EDKA1&gt; PARVW RS, LIFNR, NAME1, STRAS, ORT01, PSTLZ &lt;/E1EDKA1&gt;</w:t>
+        <w:t xml:space="preserve">      &lt;CRETIM&gt;103506&lt;/CRETIM&gt;</w:t>
       </w:r>
     </w:p>
     <w:p>
@@ -11107,7 +11107,7 @@
           <w:sz w:val="16"/>
           <w:szCs w:val="16"/>
         </w:rPr>
-        <w:t xml:space="preserve">    &lt;E1EDK02&gt; QUALF 009, 010, 011, 017, 084, 001, 902 + BELNR &lt;/E1EDK02&gt;   (repeated)</w:t>
+        <w:t xml:space="preserve">    &lt;/EDI_DC40&gt;</w:t>
       </w:r>
     </w:p>
     <w:p>
@@ -11120,7 +11120,7 @@
           <w:sz w:val="16"/>
           <w:szCs w:val="16"/>
         </w:rPr>
-        <w:t xml:space="preserve">    &lt;E1EDK03&gt; IDDAT 001, 012, 016, 047 + DATUM &lt;/E1EDK03&gt;   (repeated)</w:t>
+        <w:t xml:space="preserve">    &lt;E1EDK01 SEGMENT="1"&gt;</w:t>
       </w:r>
     </w:p>
     <w:p>
@@ -11133,7 +11133,7 @@
           <w:sz w:val="16"/>
           <w:szCs w:val="16"/>
         </w:rPr>
-        <w:t xml:space="preserve">    &lt;E1EDK04&gt; MWSBT &lt;/E1EDK04&gt;</w:t>
+        <w:t xml:space="preserve">      &lt;CURCY&gt;USD&lt;/CURCY&gt;</w:t>
       </w:r>
     </w:p>
     <w:p>
@@ -11146,7 +11146,7 @@
           <w:sz w:val="16"/>
           <w:szCs w:val="16"/>
         </w:rPr>
-        <w:t xml:space="preserve">    &lt;E1EDK28/&gt;</w:t>
+        <w:t xml:space="preserve">      &lt;KUNDEUINR&gt;NA&lt;/KUNDEUINR&gt;</w:t>
       </w:r>
     </w:p>
     <w:p>
@@ -11159,7 +11159,7 @@
           <w:sz w:val="16"/>
           <w:szCs w:val="16"/>
         </w:rPr>
-        <w:t xml:space="preserve">    &lt;E1EDK14&gt; QUALF 011, ORGID &lt;/E1EDK14&gt;</w:t>
+        <w:t xml:space="preserve">      &lt;EIGENUINR&gt;54321&lt;/EIGENUINR&gt;</w:t>
       </w:r>
     </w:p>
     <w:p>
@@ -11172,7 +11172,7 @@
           <w:sz w:val="16"/>
           <w:szCs w:val="16"/>
         </w:rPr>
-        <w:t xml:space="preserve">    &lt;E1EDP01&gt; POSEX, MENGE, MENEE</w:t>
+        <w:t xml:space="preserve">      &lt;BSART&gt;INVO&lt;/BSART&gt;</w:t>
       </w:r>
     </w:p>
     <w:p>
@@ -11185,7 +11185,7 @@
           <w:sz w:val="16"/>
           <w:szCs w:val="16"/>
         </w:rPr>
-        <w:t xml:space="preserve">      &lt;ZE1EDL24/&gt;  &lt;E1EDP02&gt; QUALF 001, ZEILE &lt;/E1EDP02&gt;</w:t>
+        <w:t xml:space="preserve">      &lt;ZPP_INVOIC02 SEGMENT="1"&gt;</w:t>
       </w:r>
     </w:p>
     <w:p>
@@ -11198,7 +11198,7 @@
           <w:sz w:val="16"/>
           <w:szCs w:val="16"/>
         </w:rPr>
-        <w:t xml:space="preserve">      &lt;E1EDP19&gt; QUALF 002, IDTNR, KTEXT &lt;/E1EDP19&gt;</w:t>
+        <w:t xml:space="preserve">        &lt;SCAN_ID&gt;AAA000322719244&lt;/SCAN_ID&gt;</w:t>
       </w:r>
     </w:p>
     <w:p>
@@ -11211,7 +11211,7 @@
           <w:sz w:val="16"/>
           <w:szCs w:val="16"/>
         </w:rPr>
-        <w:t xml:space="preserve">      &lt;E1EDP26&gt; QUALF 003 / 002, BETRG &lt;/E1EDP26&gt;   (repeated)</w:t>
+        <w:t xml:space="preserve">        &lt;OCR_ID&gt;136&lt;/OCR_ID&gt;</w:t>
       </w:r>
     </w:p>
     <w:p>
@@ -11224,7 +11224,7 @@
           <w:sz w:val="16"/>
           <w:szCs w:val="16"/>
         </w:rPr>
-        <w:t xml:space="preserve">      &lt;E1EDP04&gt; MWSBT &lt;/E1EDP04&gt;</w:t>
+        <w:t xml:space="preserve">        &lt;REQUESTER&gt;requester@example.com&lt;/REQUESTER&gt;</w:t>
       </w:r>
     </w:p>
     <w:p>
@@ -11237,7 +11237,7 @@
           <w:sz w:val="16"/>
           <w:szCs w:val="16"/>
         </w:rPr>
-        <w:t xml:space="preserve">    &lt;/E1EDP01&gt;</w:t>
+        <w:t xml:space="preserve">        &lt;RECEPT_DATE&gt;20261008&lt;/RECEPT_DATE&gt;</w:t>
       </w:r>
     </w:p>
     <w:p>
@@ -11250,7 +11250,1541 @@
           <w:sz w:val="16"/>
           <w:szCs w:val="16"/>
         </w:rPr>
-        <w:t xml:space="preserve">    &lt;E1EDS01&gt; SUMID 002, 003, 010 + SUMME &lt;/E1EDS01&gt;   (repeated)</w:t>
+        <w:t xml:space="preserve">        &lt;RECEPT_TIME&gt;120814&lt;/RECEPT_TIME&gt;</w:t>
+      </w:r>
+    </w:p>
+    <w:p>
+      <w:pPr>
+        <w:spacing w:after="0" w:line="240" w:lineRule="auto"/>
+      </w:pPr>
+      <w:r>
+        <w:rPr>
+          <w:rFonts w:ascii="Courier New" w:hAnsi="Courier New" w:cs="Courier New"/>
+          <w:sz w:val="16"/>
+          <w:szCs w:val="16"/>
+        </w:rPr>
+        <w:t xml:space="preserve">        &lt;SCAN_DATE&gt;20261008&lt;/SCAN_DATE&gt;</w:t>
+      </w:r>
+    </w:p>
+    <w:p>
+      <w:pPr>
+        <w:spacing w:after="0" w:line="240" w:lineRule="auto"/>
+      </w:pPr>
+      <w:r>
+        <w:rPr>
+          <w:rFonts w:ascii="Courier New" w:hAnsi="Courier New" w:cs="Courier New"/>
+          <w:sz w:val="16"/>
+          <w:szCs w:val="16"/>
+        </w:rPr>
+        <w:t xml:space="preserve">        &lt;SCAN_TIME&gt;120814&lt;/SCAN_TIME&gt;</w:t>
+      </w:r>
+    </w:p>
+    <w:p>
+      <w:pPr>
+        <w:spacing w:after="0" w:line="240" w:lineRule="auto"/>
+      </w:pPr>
+      <w:r>
+        <w:rPr>
+          <w:rFonts w:ascii="Courier New" w:hAnsi="Courier New" w:cs="Courier New"/>
+          <w:sz w:val="16"/>
+          <w:szCs w:val="16"/>
+        </w:rPr>
+        <w:t xml:space="preserve">        &lt;RECEIV_DATE&gt;20261008&lt;/RECEIV_DATE&gt;</w:t>
+      </w:r>
+    </w:p>
+    <w:p>
+      <w:pPr>
+        <w:spacing w:after="0" w:line="240" w:lineRule="auto"/>
+      </w:pPr>
+      <w:r>
+        <w:rPr>
+          <w:rFonts w:ascii="Courier New" w:hAnsi="Courier New" w:cs="Courier New"/>
+          <w:sz w:val="16"/>
+          <w:szCs w:val="16"/>
+        </w:rPr>
+        <w:t xml:space="preserve">        &lt;RECEIV_TIME&gt;133008&lt;/RECEIV_TIME&gt;</w:t>
+      </w:r>
+    </w:p>
+    <w:p>
+      <w:pPr>
+        <w:spacing w:after="0" w:line="240" w:lineRule="auto"/>
+      </w:pPr>
+      <w:r>
+        <w:rPr>
+          <w:rFonts w:ascii="Courier New" w:hAnsi="Courier New" w:cs="Courier New"/>
+          <w:sz w:val="16"/>
+          <w:szCs w:val="16"/>
+        </w:rPr>
+        <w:t xml:space="preserve">        &lt;IDOC_TR_DATE&gt;20261008&lt;/IDOC_TR_DATE&gt;</w:t>
+      </w:r>
+    </w:p>
+    <w:p>
+      <w:pPr>
+        <w:spacing w:after="0" w:line="240" w:lineRule="auto"/>
+      </w:pPr>
+      <w:r>
+        <w:rPr>
+          <w:rFonts w:ascii="Courier New" w:hAnsi="Courier New" w:cs="Courier New"/>
+          <w:sz w:val="16"/>
+          <w:szCs w:val="16"/>
+        </w:rPr>
+        <w:t xml:space="preserve">        &lt;IDOC_TR_TIME&gt;133008&lt;/IDOC_TR_TIME&gt;</w:t>
+      </w:r>
+    </w:p>
+    <w:p>
+      <w:pPr>
+        <w:spacing w:after="0" w:line="240" w:lineRule="auto"/>
+      </w:pPr>
+      <w:r>
+        <w:rPr>
+          <w:rFonts w:ascii="Courier New" w:hAnsi="Courier New" w:cs="Courier New"/>
+          <w:sz w:val="16"/>
+          <w:szCs w:val="16"/>
+        </w:rPr>
+        <w:t xml:space="preserve">        &lt;BVTYP&gt;ZZZ&lt;/BVTYP&gt;</w:t>
+      </w:r>
+    </w:p>
+    <w:p>
+      <w:pPr>
+        <w:spacing w:after="0" w:line="240" w:lineRule="auto"/>
+      </w:pPr>
+      <w:r>
+        <w:rPr>
+          <w:rFonts w:ascii="Courier New" w:hAnsi="Courier New" w:cs="Courier New"/>
+          <w:sz w:val="16"/>
+          <w:szCs w:val="16"/>
+        </w:rPr>
+        <w:t xml:space="preserve">      &lt;/ZPP_INVOIC02&gt;</w:t>
+      </w:r>
+    </w:p>
+    <w:p>
+      <w:pPr>
+        <w:spacing w:after="0" w:line="240" w:lineRule="auto"/>
+      </w:pPr>
+      <w:r>
+        <w:rPr>
+          <w:rFonts w:ascii="Courier New" w:hAnsi="Courier New" w:cs="Courier New"/>
+          <w:sz w:val="16"/>
+          <w:szCs w:val="16"/>
+        </w:rPr>
+        <w:t xml:space="preserve">      &lt;ZPP_INVOIC02_02 SEGMENT="1"&gt;</w:t>
+      </w:r>
+    </w:p>
+    <w:p>
+      <w:pPr>
+        <w:spacing w:after="0" w:line="240" w:lineRule="auto"/>
+      </w:pPr>
+      <w:r>
+        <w:rPr>
+          <w:rFonts w:ascii="Courier New" w:hAnsi="Courier New" w:cs="Courier New"/>
+          <w:sz w:val="16"/>
+          <w:szCs w:val="16"/>
+        </w:rPr>
+        <w:t xml:space="preserve">        &lt;FILEP&gt;AAA000322719244.pdf&lt;/FILEP&gt;</w:t>
+      </w:r>
+    </w:p>
+    <w:p>
+      <w:pPr>
+        <w:spacing w:after="0" w:line="240" w:lineRule="auto"/>
+      </w:pPr>
+      <w:r>
+        <w:rPr>
+          <w:rFonts w:ascii="Courier New" w:hAnsi="Courier New" w:cs="Courier New"/>
+          <w:sz w:val="16"/>
+          <w:szCs w:val="16"/>
+        </w:rPr>
+        <w:t xml:space="preserve">        &lt;DOC_TYPE&gt;YVIMPORIMG&lt;/DOC_TYPE&gt;</w:t>
+      </w:r>
+    </w:p>
+    <w:p>
+      <w:pPr>
+        <w:spacing w:after="0" w:line="240" w:lineRule="auto"/>
+      </w:pPr>
+      <w:r>
+        <w:rPr>
+          <w:rFonts w:ascii="Courier New" w:hAnsi="Courier New" w:cs="Courier New"/>
+          <w:sz w:val="16"/>
+          <w:szCs w:val="16"/>
+        </w:rPr>
+        <w:t xml:space="preserve">      &lt;/ZPP_INVOIC02_02&gt;</w:t>
+      </w:r>
+    </w:p>
+    <w:p>
+      <w:pPr>
+        <w:spacing w:after="0" w:line="240" w:lineRule="auto"/>
+      </w:pPr>
+      <w:r>
+        <w:rPr>
+          <w:rFonts w:ascii="Courier New" w:hAnsi="Courier New" w:cs="Courier New"/>
+          <w:sz w:val="16"/>
+          <w:szCs w:val="16"/>
+        </w:rPr>
+        <w:t xml:space="preserve">      &lt;ZPP_INVOIC02_02 SEGMENT="1"&gt;</w:t>
+      </w:r>
+    </w:p>
+    <w:p>
+      <w:pPr>
+        <w:spacing w:after="0" w:line="240" w:lineRule="auto"/>
+      </w:pPr>
+      <w:r>
+        <w:rPr>
+          <w:rFonts w:ascii="Courier New" w:hAnsi="Courier New" w:cs="Courier New"/>
+          <w:sz w:val="16"/>
+          <w:szCs w:val="16"/>
+        </w:rPr>
+        <w:t xml:space="preserve">        &lt;FILEP&gt;AAA000322719244.xml&lt;/FILEP&gt;</w:t>
+      </w:r>
+    </w:p>
+    <w:p>
+      <w:pPr>
+        <w:spacing w:after="0" w:line="240" w:lineRule="auto"/>
+      </w:pPr>
+      <w:r>
+        <w:rPr>
+          <w:rFonts w:ascii="Courier New" w:hAnsi="Courier New" w:cs="Courier New"/>
+          <w:sz w:val="16"/>
+          <w:szCs w:val="16"/>
+        </w:rPr>
+        <w:t xml:space="preserve">        &lt;DOC_TYPE&gt;XML&lt;/DOC_TYPE&gt;</w:t>
+      </w:r>
+    </w:p>
+    <w:p>
+      <w:pPr>
+        <w:spacing w:after="0" w:line="240" w:lineRule="auto"/>
+      </w:pPr>
+      <w:r>
+        <w:rPr>
+          <w:rFonts w:ascii="Courier New" w:hAnsi="Courier New" w:cs="Courier New"/>
+          <w:sz w:val="16"/>
+          <w:szCs w:val="16"/>
+        </w:rPr>
+        <w:t xml:space="preserve">      &lt;/ZPP_INVOIC02_02&gt;</w:t>
+      </w:r>
+    </w:p>
+    <w:p>
+      <w:pPr>
+        <w:spacing w:after="0" w:line="240" w:lineRule="auto"/>
+      </w:pPr>
+      <w:r>
+        <w:rPr>
+          <w:rFonts w:ascii="Courier New" w:hAnsi="Courier New" w:cs="Courier New"/>
+          <w:sz w:val="16"/>
+          <w:szCs w:val="16"/>
+        </w:rPr>
+        <w:t xml:space="preserve">      &lt;ZPP_INVOIC02_02 SEGMENT="1"&gt;</w:t>
+      </w:r>
+    </w:p>
+    <w:p>
+      <w:pPr>
+        <w:spacing w:after="0" w:line="240" w:lineRule="auto"/>
+      </w:pPr>
+      <w:r>
+        <w:rPr>
+          <w:rFonts w:ascii="Courier New" w:hAnsi="Courier New" w:cs="Courier New"/>
+          <w:sz w:val="16"/>
+          <w:szCs w:val="16"/>
+        </w:rPr>
+        <w:t xml:space="preserve">        &lt;FILEP&gt;AAA000322719244.html&lt;/FILEP&gt;</w:t>
+      </w:r>
+    </w:p>
+    <w:p>
+      <w:pPr>
+        <w:spacing w:after="0" w:line="240" w:lineRule="auto"/>
+      </w:pPr>
+      <w:r>
+        <w:rPr>
+          <w:rFonts w:ascii="Courier New" w:hAnsi="Courier New" w:cs="Courier New"/>
+          <w:sz w:val="16"/>
+          <w:szCs w:val="16"/>
+        </w:rPr>
+        <w:t xml:space="preserve">        &lt;DOC_TYPE&gt;HTML&lt;/DOC_TYPE&gt;</w:t>
+      </w:r>
+    </w:p>
+    <w:p>
+      <w:pPr>
+        <w:spacing w:after="0" w:line="240" w:lineRule="auto"/>
+      </w:pPr>
+      <w:r>
+        <w:rPr>
+          <w:rFonts w:ascii="Courier New" w:hAnsi="Courier New" w:cs="Courier New"/>
+          <w:sz w:val="16"/>
+          <w:szCs w:val="16"/>
+        </w:rPr>
+        <w:t xml:space="preserve">      &lt;/ZPP_INVOIC02_02&gt;</w:t>
+      </w:r>
+    </w:p>
+    <w:p>
+      <w:pPr>
+        <w:spacing w:after="0" w:line="240" w:lineRule="auto"/>
+      </w:pPr>
+      <w:r>
+        <w:rPr>
+          <w:rFonts w:ascii="Courier New" w:hAnsi="Courier New" w:cs="Courier New"/>
+          <w:sz w:val="16"/>
+          <w:szCs w:val="16"/>
+        </w:rPr>
+        <w:t xml:space="preserve">      &lt;ZPP_INVOIC02_URL SEGMENT="1"&gt;</w:t>
+      </w:r>
+    </w:p>
+    <w:p>
+      <w:pPr>
+        <w:spacing w:after="0" w:line="240" w:lineRule="auto"/>
+      </w:pPr>
+      <w:r>
+        <w:rPr>
+          <w:rFonts w:ascii="Courier New" w:hAnsi="Courier New" w:cs="Courier New"/>
+          <w:sz w:val="16"/>
+          <w:szCs w:val="16"/>
+        </w:rPr>
+        <w:t xml:space="preserve">        &lt;URL&gt;https://&amp;lt;archive link of the document&amp;gt;&lt;/URL&gt;</w:t>
+      </w:r>
+    </w:p>
+    <w:p>
+      <w:pPr>
+        <w:spacing w:after="0" w:line="240" w:lineRule="auto"/>
+      </w:pPr>
+      <w:r>
+        <w:rPr>
+          <w:rFonts w:ascii="Courier New" w:hAnsi="Courier New" w:cs="Courier New"/>
+          <w:sz w:val="16"/>
+          <w:szCs w:val="16"/>
+        </w:rPr>
+        <w:t xml:space="preserve">        &lt;DOC_TYPE&gt;URL&lt;/DOC_TYPE&gt;</w:t>
+      </w:r>
+    </w:p>
+    <w:p>
+      <w:pPr>
+        <w:spacing w:after="0" w:line="240" w:lineRule="auto"/>
+      </w:pPr>
+      <w:r>
+        <w:rPr>
+          <w:rFonts w:ascii="Courier New" w:hAnsi="Courier New" w:cs="Courier New"/>
+          <w:sz w:val="16"/>
+          <w:szCs w:val="16"/>
+        </w:rPr>
+        <w:t xml:space="preserve">      &lt;/ZPP_INVOIC02_URL&gt;</w:t>
+      </w:r>
+    </w:p>
+    <w:p>
+      <w:pPr>
+        <w:spacing w:after="0" w:line="240" w:lineRule="auto"/>
+      </w:pPr>
+      <w:r>
+        <w:rPr>
+          <w:rFonts w:ascii="Courier New" w:hAnsi="Courier New" w:cs="Courier New"/>
+          <w:sz w:val="16"/>
+          <w:szCs w:val="16"/>
+        </w:rPr>
+        <w:t xml:space="preserve">    &lt;/E1EDK01&gt;</w:t>
+      </w:r>
+    </w:p>
+    <w:p>
+      <w:pPr>
+        <w:spacing w:after="0" w:line="240" w:lineRule="auto"/>
+      </w:pPr>
+      <w:r>
+        <w:rPr>
+          <w:rFonts w:ascii="Courier New" w:hAnsi="Courier New" w:cs="Courier New"/>
+          <w:sz w:val="16"/>
+          <w:szCs w:val="16"/>
+        </w:rPr>
+        <w:t xml:space="preserve">    &lt;E1EDKA1 SEGMENT="1"&gt;</w:t>
+      </w:r>
+    </w:p>
+    <w:p>
+      <w:pPr>
+        <w:spacing w:after="0" w:line="240" w:lineRule="auto"/>
+      </w:pPr>
+      <w:r>
+        <w:rPr>
+          <w:rFonts w:ascii="Courier New" w:hAnsi="Courier New" w:cs="Courier New"/>
+          <w:sz w:val="16"/>
+          <w:szCs w:val="16"/>
+        </w:rPr>
+        <w:t xml:space="preserve">      &lt;PARVW&gt;RS&lt;/PARVW&gt;</w:t>
+      </w:r>
+    </w:p>
+    <w:p>
+      <w:pPr>
+        <w:spacing w:after="0" w:line="240" w:lineRule="auto"/>
+      </w:pPr>
+      <w:r>
+        <w:rPr>
+          <w:rFonts w:ascii="Courier New" w:hAnsi="Courier New" w:cs="Courier New"/>
+          <w:sz w:val="16"/>
+          <w:szCs w:val="16"/>
+        </w:rPr>
+        <w:t xml:space="preserve">      &lt;LIFNR&gt;0100070904&lt;/LIFNR&gt;</w:t>
+      </w:r>
+    </w:p>
+    <w:p>
+      <w:pPr>
+        <w:spacing w:after="0" w:line="240" w:lineRule="auto"/>
+      </w:pPr>
+      <w:r>
+        <w:rPr>
+          <w:rFonts w:ascii="Courier New" w:hAnsi="Courier New" w:cs="Courier New"/>
+          <w:sz w:val="16"/>
+          <w:szCs w:val="16"/>
+        </w:rPr>
+        <w:t xml:space="preserve">      &lt;NAME1&gt;Plymouth Printing Co Inc - TEST&lt;/NAME1&gt;</w:t>
+      </w:r>
+    </w:p>
+    <w:p>
+      <w:pPr>
+        <w:spacing w:after="0" w:line="240" w:lineRule="auto"/>
+      </w:pPr>
+      <w:r>
+        <w:rPr>
+          <w:rFonts w:ascii="Courier New" w:hAnsi="Courier New" w:cs="Courier New"/>
+          <w:sz w:val="16"/>
+          <w:szCs w:val="16"/>
+        </w:rPr>
+        <w:t xml:space="preserve">      &lt;STRAS&gt;Plymouth Printing Co Inc - TEST&lt;/STRAS&gt;</w:t>
+      </w:r>
+    </w:p>
+    <w:p>
+      <w:pPr>
+        <w:spacing w:after="0" w:line="240" w:lineRule="auto"/>
+      </w:pPr>
+      <w:r>
+        <w:rPr>
+          <w:rFonts w:ascii="Courier New" w:hAnsi="Courier New" w:cs="Courier New"/>
+          <w:sz w:val="16"/>
+          <w:szCs w:val="16"/>
+        </w:rPr>
+        <w:t xml:space="preserve">      &lt;ORT01&gt;Winston Salem&lt;/ORT01&gt;</w:t>
+      </w:r>
+    </w:p>
+    <w:p>
+      <w:pPr>
+        <w:spacing w:after="0" w:line="240" w:lineRule="auto"/>
+      </w:pPr>
+      <w:r>
+        <w:rPr>
+          <w:rFonts w:ascii="Courier New" w:hAnsi="Courier New" w:cs="Courier New"/>
+          <w:sz w:val="16"/>
+          <w:szCs w:val="16"/>
+        </w:rPr>
+        <w:t xml:space="preserve">      &lt;PSTLZ&gt;NC&lt;/PSTLZ&gt;</w:t>
+      </w:r>
+    </w:p>
+    <w:p>
+      <w:pPr>
+        <w:spacing w:after="0" w:line="240" w:lineRule="auto"/>
+      </w:pPr>
+      <w:r>
+        <w:rPr>
+          <w:rFonts w:ascii="Courier New" w:hAnsi="Courier New" w:cs="Courier New"/>
+          <w:sz w:val="16"/>
+          <w:szCs w:val="16"/>
+        </w:rPr>
+        <w:t xml:space="preserve">    &lt;/E1EDKA1&gt;</w:t>
+      </w:r>
+    </w:p>
+    <w:p>
+      <w:pPr>
+        <w:spacing w:after="0" w:line="240" w:lineRule="auto"/>
+      </w:pPr>
+      <w:r>
+        <w:rPr>
+          <w:rFonts w:ascii="Courier New" w:hAnsi="Courier New" w:cs="Courier New"/>
+          <w:sz w:val="16"/>
+          <w:szCs w:val="16"/>
+        </w:rPr>
+        <w:t xml:space="preserve">    &lt;E1EDK02 SEGMENT="1"&gt;</w:t>
+      </w:r>
+    </w:p>
+    <w:p>
+      <w:pPr>
+        <w:spacing w:after="0" w:line="240" w:lineRule="auto"/>
+      </w:pPr>
+      <w:r>
+        <w:rPr>
+          <w:rFonts w:ascii="Courier New" w:hAnsi="Courier New" w:cs="Courier New"/>
+          <w:sz w:val="16"/>
+          <w:szCs w:val="16"/>
+        </w:rPr>
+        <w:t xml:space="preserve">      &lt;QUALF&gt;009&lt;/QUALF&gt;</w:t>
+      </w:r>
+    </w:p>
+    <w:p>
+      <w:pPr>
+        <w:spacing w:after="0" w:line="240" w:lineRule="auto"/>
+      </w:pPr>
+      <w:r>
+        <w:rPr>
+          <w:rFonts w:ascii="Courier New" w:hAnsi="Courier New" w:cs="Courier New"/>
+          <w:sz w:val="16"/>
+          <w:szCs w:val="16"/>
+        </w:rPr>
+        <w:t xml:space="preserve">      &lt;BELNR&gt;176893&lt;/BELNR&gt;</w:t>
+      </w:r>
+    </w:p>
+    <w:p>
+      <w:pPr>
+        <w:spacing w:after="0" w:line="240" w:lineRule="auto"/>
+      </w:pPr>
+      <w:r>
+        <w:rPr>
+          <w:rFonts w:ascii="Courier New" w:hAnsi="Courier New" w:cs="Courier New"/>
+          <w:sz w:val="16"/>
+          <w:szCs w:val="16"/>
+        </w:rPr>
+        <w:t xml:space="preserve">    &lt;/E1EDK02&gt;</w:t>
+      </w:r>
+    </w:p>
+    <w:p>
+      <w:pPr>
+        <w:spacing w:after="0" w:line="240" w:lineRule="auto"/>
+      </w:pPr>
+      <w:r>
+        <w:rPr>
+          <w:rFonts w:ascii="Courier New" w:hAnsi="Courier New" w:cs="Courier New"/>
+          <w:sz w:val="16"/>
+          <w:szCs w:val="16"/>
+        </w:rPr>
+        <w:t xml:space="preserve">    &lt;E1EDK02 SEGMENT="1"&gt;</w:t>
+      </w:r>
+    </w:p>
+    <w:p>
+      <w:pPr>
+        <w:spacing w:after="0" w:line="240" w:lineRule="auto"/>
+      </w:pPr>
+      <w:r>
+        <w:rPr>
+          <w:rFonts w:ascii="Courier New" w:hAnsi="Courier New" w:cs="Courier New"/>
+          <w:sz w:val="16"/>
+          <w:szCs w:val="16"/>
+        </w:rPr>
+        <w:t xml:space="preserve">      &lt;QUALF&gt;010&lt;/QUALF&gt;</w:t>
+      </w:r>
+    </w:p>
+    <w:p>
+      <w:pPr>
+        <w:spacing w:after="0" w:line="240" w:lineRule="auto"/>
+      </w:pPr>
+      <w:r>
+        <w:rPr>
+          <w:rFonts w:ascii="Courier New" w:hAnsi="Courier New" w:cs="Courier New"/>
+          <w:sz w:val="16"/>
+          <w:szCs w:val="16"/>
+        </w:rPr>
+        <w:t xml:space="preserve">      &lt;BELNR&gt;176893&lt;/BELNR&gt;</w:t>
+      </w:r>
+    </w:p>
+    <w:p>
+      <w:pPr>
+        <w:spacing w:after="0" w:line="240" w:lineRule="auto"/>
+      </w:pPr>
+      <w:r>
+        <w:rPr>
+          <w:rFonts w:ascii="Courier New" w:hAnsi="Courier New" w:cs="Courier New"/>
+          <w:sz w:val="16"/>
+          <w:szCs w:val="16"/>
+        </w:rPr>
+        <w:t xml:space="preserve">    &lt;/E1EDK02&gt;</w:t>
+      </w:r>
+    </w:p>
+    <w:p>
+      <w:pPr>
+        <w:spacing w:after="0" w:line="240" w:lineRule="auto"/>
+      </w:pPr>
+      <w:r>
+        <w:rPr>
+          <w:rFonts w:ascii="Courier New" w:hAnsi="Courier New" w:cs="Courier New"/>
+          <w:sz w:val="16"/>
+          <w:szCs w:val="16"/>
+        </w:rPr>
+        <w:t xml:space="preserve">    &lt;E1EDK02 SEGMENT="1"&gt;</w:t>
+      </w:r>
+    </w:p>
+    <w:p>
+      <w:pPr>
+        <w:spacing w:after="0" w:line="240" w:lineRule="auto"/>
+      </w:pPr>
+      <w:r>
+        <w:rPr>
+          <w:rFonts w:ascii="Courier New" w:hAnsi="Courier New" w:cs="Courier New"/>
+          <w:sz w:val="16"/>
+          <w:szCs w:val="16"/>
+        </w:rPr>
+        <w:t xml:space="preserve">      &lt;QUALF&gt;011&lt;/QUALF&gt;</w:t>
+      </w:r>
+    </w:p>
+    <w:p>
+      <w:pPr>
+        <w:spacing w:after="0" w:line="240" w:lineRule="auto"/>
+      </w:pPr>
+      <w:r>
+        <w:rPr>
+          <w:rFonts w:ascii="Courier New" w:hAnsi="Courier New" w:cs="Courier New"/>
+          <w:sz w:val="16"/>
+          <w:szCs w:val="16"/>
+        </w:rPr>
+        <w:t xml:space="preserve">    &lt;/E1EDK02&gt;</w:t>
+      </w:r>
+    </w:p>
+    <w:p>
+      <w:pPr>
+        <w:spacing w:after="0" w:line="240" w:lineRule="auto"/>
+      </w:pPr>
+      <w:r>
+        <w:rPr>
+          <w:rFonts w:ascii="Courier New" w:hAnsi="Courier New" w:cs="Courier New"/>
+          <w:sz w:val="16"/>
+          <w:szCs w:val="16"/>
+        </w:rPr>
+        <w:t xml:space="preserve">    &lt;E1EDK02 SEGMENT="1"&gt;</w:t>
+      </w:r>
+    </w:p>
+    <w:p>
+      <w:pPr>
+        <w:spacing w:after="0" w:line="240" w:lineRule="auto"/>
+      </w:pPr>
+      <w:r>
+        <w:rPr>
+          <w:rFonts w:ascii="Courier New" w:hAnsi="Courier New" w:cs="Courier New"/>
+          <w:sz w:val="16"/>
+          <w:szCs w:val="16"/>
+        </w:rPr>
+        <w:t xml:space="preserve">      &lt;QUALF&gt;017&lt;/QUALF&gt;</w:t>
+      </w:r>
+    </w:p>
+    <w:p>
+      <w:pPr>
+        <w:spacing w:after="0" w:line="240" w:lineRule="auto"/>
+      </w:pPr>
+      <w:r>
+        <w:rPr>
+          <w:rFonts w:ascii="Courier New" w:hAnsi="Courier New" w:cs="Courier New"/>
+          <w:sz w:val="16"/>
+          <w:szCs w:val="16"/>
+        </w:rPr>
+        <w:t xml:space="preserve">    &lt;/E1EDK02&gt;</w:t>
+      </w:r>
+    </w:p>
+    <w:p>
+      <w:pPr>
+        <w:spacing w:after="0" w:line="240" w:lineRule="auto"/>
+      </w:pPr>
+      <w:r>
+        <w:rPr>
+          <w:rFonts w:ascii="Courier New" w:hAnsi="Courier New" w:cs="Courier New"/>
+          <w:sz w:val="16"/>
+          <w:szCs w:val="16"/>
+        </w:rPr>
+        <w:t xml:space="preserve">    &lt;E1EDK02 SEGMENT="1"&gt;</w:t>
+      </w:r>
+    </w:p>
+    <w:p>
+      <w:pPr>
+        <w:spacing w:after="0" w:line="240" w:lineRule="auto"/>
+      </w:pPr>
+      <w:r>
+        <w:rPr>
+          <w:rFonts w:ascii="Courier New" w:hAnsi="Courier New" w:cs="Courier New"/>
+          <w:sz w:val="16"/>
+          <w:szCs w:val="16"/>
+        </w:rPr>
+        <w:t xml:space="preserve">      &lt;QUALF&gt;084&lt;/QUALF&gt;</w:t>
+      </w:r>
+    </w:p>
+    <w:p>
+      <w:pPr>
+        <w:spacing w:after="0" w:line="240" w:lineRule="auto"/>
+      </w:pPr>
+      <w:r>
+        <w:rPr>
+          <w:rFonts w:ascii="Courier New" w:hAnsi="Courier New" w:cs="Courier New"/>
+          <w:sz w:val="16"/>
+          <w:szCs w:val="16"/>
+        </w:rPr>
+        <w:t xml:space="preserve">    &lt;/E1EDK02&gt;</w:t>
+      </w:r>
+    </w:p>
+    <w:p>
+      <w:pPr>
+        <w:spacing w:after="0" w:line="240" w:lineRule="auto"/>
+      </w:pPr>
+      <w:r>
+        <w:rPr>
+          <w:rFonts w:ascii="Courier New" w:hAnsi="Courier New" w:cs="Courier New"/>
+          <w:sz w:val="16"/>
+          <w:szCs w:val="16"/>
+        </w:rPr>
+        <w:t xml:space="preserve">    &lt;E1EDK02 SEGMENT="1"&gt;</w:t>
+      </w:r>
+    </w:p>
+    <w:p>
+      <w:pPr>
+        <w:spacing w:after="0" w:line="240" w:lineRule="auto"/>
+      </w:pPr>
+      <w:r>
+        <w:rPr>
+          <w:rFonts w:ascii="Courier New" w:hAnsi="Courier New" w:cs="Courier New"/>
+          <w:sz w:val="16"/>
+          <w:szCs w:val="16"/>
+        </w:rPr>
+        <w:t xml:space="preserve">      &lt;QUALF&gt;001&lt;/QUALF&gt;</w:t>
+      </w:r>
+    </w:p>
+    <w:p>
+      <w:pPr>
+        <w:spacing w:after="0" w:line="240" w:lineRule="auto"/>
+      </w:pPr>
+      <w:r>
+        <w:rPr>
+          <w:rFonts w:ascii="Courier New" w:hAnsi="Courier New" w:cs="Courier New"/>
+          <w:sz w:val="16"/>
+          <w:szCs w:val="16"/>
+        </w:rPr>
+        <w:t xml:space="preserve">    &lt;/E1EDK02&gt;</w:t>
+      </w:r>
+    </w:p>
+    <w:p>
+      <w:pPr>
+        <w:spacing w:after="0" w:line="240" w:lineRule="auto"/>
+      </w:pPr>
+      <w:r>
+        <w:rPr>
+          <w:rFonts w:ascii="Courier New" w:hAnsi="Courier New" w:cs="Courier New"/>
+          <w:sz w:val="16"/>
+          <w:szCs w:val="16"/>
+        </w:rPr>
+        <w:t xml:space="preserve">    &lt;E1EDK02 SEGMENT="1"&gt;</w:t>
+      </w:r>
+    </w:p>
+    <w:p>
+      <w:pPr>
+        <w:spacing w:after="0" w:line="240" w:lineRule="auto"/>
+      </w:pPr>
+      <w:r>
+        <w:rPr>
+          <w:rFonts w:ascii="Courier New" w:hAnsi="Courier New" w:cs="Courier New"/>
+          <w:sz w:val="16"/>
+          <w:szCs w:val="16"/>
+        </w:rPr>
+        <w:t xml:space="preserve">      &lt;QUALF&gt;902&lt;/QUALF&gt;</w:t>
+      </w:r>
+    </w:p>
+    <w:p>
+      <w:pPr>
+        <w:spacing w:after="0" w:line="240" w:lineRule="auto"/>
+      </w:pPr>
+      <w:r>
+        <w:rPr>
+          <w:rFonts w:ascii="Courier New" w:hAnsi="Courier New" w:cs="Courier New"/>
+          <w:sz w:val="16"/>
+          <w:szCs w:val="16"/>
+        </w:rPr>
+        <w:t xml:space="preserve">    &lt;/E1EDK02&gt;</w:t>
+      </w:r>
+    </w:p>
+    <w:p>
+      <w:pPr>
+        <w:spacing w:after="0" w:line="240" w:lineRule="auto"/>
+      </w:pPr>
+      <w:r>
+        <w:rPr>
+          <w:rFonts w:ascii="Courier New" w:hAnsi="Courier New" w:cs="Courier New"/>
+          <w:sz w:val="16"/>
+          <w:szCs w:val="16"/>
+        </w:rPr>
+        <w:t xml:space="preserve">    &lt;E1EDK03 SEGMENT="1"&gt;</w:t>
+      </w:r>
+    </w:p>
+    <w:p>
+      <w:pPr>
+        <w:spacing w:after="0" w:line="240" w:lineRule="auto"/>
+      </w:pPr>
+      <w:r>
+        <w:rPr>
+          <w:rFonts w:ascii="Courier New" w:hAnsi="Courier New" w:cs="Courier New"/>
+          <w:sz w:val="16"/>
+          <w:szCs w:val="16"/>
+        </w:rPr>
+        <w:t xml:space="preserve">      &lt;IDDAT&gt;001&lt;/IDDAT&gt;</w:t>
+      </w:r>
+    </w:p>
+    <w:p>
+      <w:pPr>
+        <w:spacing w:after="0" w:line="240" w:lineRule="auto"/>
+      </w:pPr>
+      <w:r>
+        <w:rPr>
+          <w:rFonts w:ascii="Courier New" w:hAnsi="Courier New" w:cs="Courier New"/>
+          <w:sz w:val="16"/>
+          <w:szCs w:val="16"/>
+        </w:rPr>
+        <w:t xml:space="preserve">      &lt;DATUM&gt;20261009&lt;/DATUM&gt;</w:t>
+      </w:r>
+    </w:p>
+    <w:p>
+      <w:pPr>
+        <w:spacing w:after="0" w:line="240" w:lineRule="auto"/>
+      </w:pPr>
+      <w:r>
+        <w:rPr>
+          <w:rFonts w:ascii="Courier New" w:hAnsi="Courier New" w:cs="Courier New"/>
+          <w:sz w:val="16"/>
+          <w:szCs w:val="16"/>
+        </w:rPr>
+        <w:t xml:space="preserve">    &lt;/E1EDK03&gt;</w:t>
+      </w:r>
+    </w:p>
+    <w:p>
+      <w:pPr>
+        <w:spacing w:after="0" w:line="240" w:lineRule="auto"/>
+      </w:pPr>
+      <w:r>
+        <w:rPr>
+          <w:rFonts w:ascii="Courier New" w:hAnsi="Courier New" w:cs="Courier New"/>
+          <w:sz w:val="16"/>
+          <w:szCs w:val="16"/>
+        </w:rPr>
+        <w:t xml:space="preserve">    &lt;E1EDK03 SEGMENT="1"&gt;</w:t>
+      </w:r>
+    </w:p>
+    <w:p>
+      <w:pPr>
+        <w:spacing w:after="0" w:line="240" w:lineRule="auto"/>
+      </w:pPr>
+      <w:r>
+        <w:rPr>
+          <w:rFonts w:ascii="Courier New" w:hAnsi="Courier New" w:cs="Courier New"/>
+          <w:sz w:val="16"/>
+          <w:szCs w:val="16"/>
+        </w:rPr>
+        <w:t xml:space="preserve">      &lt;IDDAT&gt;012&lt;/IDDAT&gt;</w:t>
+      </w:r>
+    </w:p>
+    <w:p>
+      <w:pPr>
+        <w:spacing w:after="0" w:line="240" w:lineRule="auto"/>
+      </w:pPr>
+      <w:r>
+        <w:rPr>
+          <w:rFonts w:ascii="Courier New" w:hAnsi="Courier New" w:cs="Courier New"/>
+          <w:sz w:val="16"/>
+          <w:szCs w:val="16"/>
+        </w:rPr>
+        <w:t xml:space="preserve">      &lt;DATUM&gt;20261008&lt;/DATUM&gt;</w:t>
+      </w:r>
+    </w:p>
+    <w:p>
+      <w:pPr>
+        <w:spacing w:after="0" w:line="240" w:lineRule="auto"/>
+      </w:pPr>
+      <w:r>
+        <w:rPr>
+          <w:rFonts w:ascii="Courier New" w:hAnsi="Courier New" w:cs="Courier New"/>
+          <w:sz w:val="16"/>
+          <w:szCs w:val="16"/>
+        </w:rPr>
+        <w:t xml:space="preserve">    &lt;/E1EDK03&gt;</w:t>
+      </w:r>
+    </w:p>
+    <w:p>
+      <w:pPr>
+        <w:spacing w:after="0" w:line="240" w:lineRule="auto"/>
+      </w:pPr>
+      <w:r>
+        <w:rPr>
+          <w:rFonts w:ascii="Courier New" w:hAnsi="Courier New" w:cs="Courier New"/>
+          <w:sz w:val="16"/>
+          <w:szCs w:val="16"/>
+        </w:rPr>
+        <w:t xml:space="preserve">    &lt;E1EDK03 SEGMENT="1"&gt;</w:t>
+      </w:r>
+    </w:p>
+    <w:p>
+      <w:pPr>
+        <w:spacing w:after="0" w:line="240" w:lineRule="auto"/>
+      </w:pPr>
+      <w:r>
+        <w:rPr>
+          <w:rFonts w:ascii="Courier New" w:hAnsi="Courier New" w:cs="Courier New"/>
+          <w:sz w:val="16"/>
+          <w:szCs w:val="16"/>
+        </w:rPr>
+        <w:t xml:space="preserve">      &lt;IDDAT&gt;016&lt;/IDDAT&gt;</w:t>
+      </w:r>
+    </w:p>
+    <w:p>
+      <w:pPr>
+        <w:spacing w:after="0" w:line="240" w:lineRule="auto"/>
+      </w:pPr>
+      <w:r>
+        <w:rPr>
+          <w:rFonts w:ascii="Courier New" w:hAnsi="Courier New" w:cs="Courier New"/>
+          <w:sz w:val="16"/>
+          <w:szCs w:val="16"/>
+        </w:rPr>
+        <w:t xml:space="preserve">      &lt;DATUM&gt;20261008&lt;/DATUM&gt;</w:t>
+      </w:r>
+    </w:p>
+    <w:p>
+      <w:pPr>
+        <w:spacing w:after="0" w:line="240" w:lineRule="auto"/>
+      </w:pPr>
+      <w:r>
+        <w:rPr>
+          <w:rFonts w:ascii="Courier New" w:hAnsi="Courier New" w:cs="Courier New"/>
+          <w:sz w:val="16"/>
+          <w:szCs w:val="16"/>
+        </w:rPr>
+        <w:t xml:space="preserve">    &lt;/E1EDK03&gt;</w:t>
+      </w:r>
+    </w:p>
+    <w:p>
+      <w:pPr>
+        <w:spacing w:after="0" w:line="240" w:lineRule="auto"/>
+      </w:pPr>
+      <w:r>
+        <w:rPr>
+          <w:rFonts w:ascii="Courier New" w:hAnsi="Courier New" w:cs="Courier New"/>
+          <w:sz w:val="16"/>
+          <w:szCs w:val="16"/>
+        </w:rPr>
+        <w:t xml:space="preserve">    &lt;E1EDK03 SEGMENT="1"&gt;</w:t>
+      </w:r>
+    </w:p>
+    <w:p>
+      <w:pPr>
+        <w:spacing w:after="0" w:line="240" w:lineRule="auto"/>
+      </w:pPr>
+      <w:r>
+        <w:rPr>
+          <w:rFonts w:ascii="Courier New" w:hAnsi="Courier New" w:cs="Courier New"/>
+          <w:sz w:val="16"/>
+          <w:szCs w:val="16"/>
+        </w:rPr>
+        <w:t xml:space="preserve">      &lt;IDDAT&gt;047&lt;/IDDAT&gt;</w:t>
+      </w:r>
+    </w:p>
+    <w:p>
+      <w:pPr>
+        <w:spacing w:after="0" w:line="240" w:lineRule="auto"/>
+      </w:pPr>
+      <w:r>
+        <w:rPr>
+          <w:rFonts w:ascii="Courier New" w:hAnsi="Courier New" w:cs="Courier New"/>
+          <w:sz w:val="16"/>
+          <w:szCs w:val="16"/>
+        </w:rPr>
+        <w:t xml:space="preserve">      &lt;DATUM&gt;20261008&lt;/DATUM&gt;</w:t>
+      </w:r>
+    </w:p>
+    <w:p>
+      <w:pPr>
+        <w:spacing w:after="0" w:line="240" w:lineRule="auto"/>
+      </w:pPr>
+      <w:r>
+        <w:rPr>
+          <w:rFonts w:ascii="Courier New" w:hAnsi="Courier New" w:cs="Courier New"/>
+          <w:sz w:val="16"/>
+          <w:szCs w:val="16"/>
+        </w:rPr>
+        <w:t xml:space="preserve">    &lt;/E1EDK03&gt;</w:t>
+      </w:r>
+    </w:p>
+    <w:p>
+      <w:pPr>
+        <w:spacing w:after="0" w:line="240" w:lineRule="auto"/>
+      </w:pPr>
+      <w:r>
+        <w:rPr>
+          <w:rFonts w:ascii="Courier New" w:hAnsi="Courier New" w:cs="Courier New"/>
+          <w:sz w:val="16"/>
+          <w:szCs w:val="16"/>
+        </w:rPr>
+        <w:t xml:space="preserve">    &lt;E1EDK04 SEGMENT="1"&gt;</w:t>
+      </w:r>
+    </w:p>
+    <w:p>
+      <w:pPr>
+        <w:spacing w:after="0" w:line="240" w:lineRule="auto"/>
+      </w:pPr>
+      <w:r>
+        <w:rPr>
+          <w:rFonts w:ascii="Courier New" w:hAnsi="Courier New" w:cs="Courier New"/>
+          <w:sz w:val="16"/>
+          <w:szCs w:val="16"/>
+        </w:rPr>
+        <w:t xml:space="preserve">      &lt;MWSBT&gt;0.00&lt;/MWSBT&gt;</w:t>
+      </w:r>
+    </w:p>
+    <w:p>
+      <w:pPr>
+        <w:spacing w:after="0" w:line="240" w:lineRule="auto"/>
+      </w:pPr>
+      <w:r>
+        <w:rPr>
+          <w:rFonts w:ascii="Courier New" w:hAnsi="Courier New" w:cs="Courier New"/>
+          <w:sz w:val="16"/>
+          <w:szCs w:val="16"/>
+        </w:rPr>
+        <w:t xml:space="preserve">    &lt;/E1EDK04&gt;</w:t>
+      </w:r>
+    </w:p>
+    <w:p>
+      <w:pPr>
+        <w:spacing w:after="0" w:line="240" w:lineRule="auto"/>
+      </w:pPr>
+      <w:r>
+        <w:rPr>
+          <w:rFonts w:ascii="Courier New" w:hAnsi="Courier New" w:cs="Courier New"/>
+          <w:sz w:val="16"/>
+          <w:szCs w:val="16"/>
+        </w:rPr>
+        <w:t xml:space="preserve">    &lt;E1EDK28 SEGMENT="1" /&gt;</w:t>
+      </w:r>
+    </w:p>
+    <w:p>
+      <w:pPr>
+        <w:spacing w:after="0" w:line="240" w:lineRule="auto"/>
+      </w:pPr>
+      <w:r>
+        <w:rPr>
+          <w:rFonts w:ascii="Courier New" w:hAnsi="Courier New" w:cs="Courier New"/>
+          <w:sz w:val="16"/>
+          <w:szCs w:val="16"/>
+        </w:rPr>
+        <w:t xml:space="preserve">    &lt;E1EDK14 SEGMENT="1"&gt;</w:t>
+      </w:r>
+    </w:p>
+    <w:p>
+      <w:pPr>
+        <w:spacing w:after="0" w:line="240" w:lineRule="auto"/>
+      </w:pPr>
+      <w:r>
+        <w:rPr>
+          <w:rFonts w:ascii="Courier New" w:hAnsi="Courier New" w:cs="Courier New"/>
+          <w:sz w:val="16"/>
+          <w:szCs w:val="16"/>
+        </w:rPr>
+        <w:t xml:space="preserve">      &lt;QUALF&gt;011&lt;/QUALF&gt;</w:t>
+      </w:r>
+    </w:p>
+    <w:p>
+      <w:pPr>
+        <w:spacing w:after="0" w:line="240" w:lineRule="auto"/>
+      </w:pPr>
+      <w:r>
+        <w:rPr>
+          <w:rFonts w:ascii="Courier New" w:hAnsi="Courier New" w:cs="Courier New"/>
+          <w:sz w:val="16"/>
+          <w:szCs w:val="16"/>
+        </w:rPr>
+        <w:t xml:space="preserve">      &lt;ORGID&gt;US03&lt;/ORGID&gt;</w:t>
+      </w:r>
+    </w:p>
+    <w:p>
+      <w:pPr>
+        <w:spacing w:after="0" w:line="240" w:lineRule="auto"/>
+      </w:pPr>
+      <w:r>
+        <w:rPr>
+          <w:rFonts w:ascii="Courier New" w:hAnsi="Courier New" w:cs="Courier New"/>
+          <w:sz w:val="16"/>
+          <w:szCs w:val="16"/>
+        </w:rPr>
+        <w:t xml:space="preserve">    &lt;/E1EDK14&gt;</w:t>
+      </w:r>
+    </w:p>
+    <w:p>
+      <w:pPr>
+        <w:spacing w:after="0" w:line="240" w:lineRule="auto"/>
+      </w:pPr>
+      <w:r>
+        <w:rPr>
+          <w:rFonts w:ascii="Courier New" w:hAnsi="Courier New" w:cs="Courier New"/>
+          <w:sz w:val="16"/>
+          <w:szCs w:val="16"/>
+        </w:rPr>
+        <w:t xml:space="preserve">    &lt;E1EDP01 SEGMENT="1"&gt;</w:t>
+      </w:r>
+    </w:p>
+    <w:p>
+      <w:pPr>
+        <w:spacing w:after="0" w:line="240" w:lineRule="auto"/>
+      </w:pPr>
+      <w:r>
+        <w:rPr>
+          <w:rFonts w:ascii="Courier New" w:hAnsi="Courier New" w:cs="Courier New"/>
+          <w:sz w:val="16"/>
+          <w:szCs w:val="16"/>
+        </w:rPr>
+        <w:t xml:space="preserve">      &lt;POSEX&gt;1&lt;/POSEX&gt;</w:t>
+      </w:r>
+    </w:p>
+    <w:p>
+      <w:pPr>
+        <w:spacing w:after="0" w:line="240" w:lineRule="auto"/>
+      </w:pPr>
+      <w:r>
+        <w:rPr>
+          <w:rFonts w:ascii="Courier New" w:hAnsi="Courier New" w:cs="Courier New"/>
+          <w:sz w:val="16"/>
+          <w:szCs w:val="16"/>
+        </w:rPr>
+        <w:t xml:space="preserve">      &lt;MENGE&gt;1&lt;/MENGE&gt;</w:t>
+      </w:r>
+    </w:p>
+    <w:p>
+      <w:pPr>
+        <w:spacing w:after="0" w:line="240" w:lineRule="auto"/>
+      </w:pPr>
+      <w:r>
+        <w:rPr>
+          <w:rFonts w:ascii="Courier New" w:hAnsi="Courier New" w:cs="Courier New"/>
+          <w:sz w:val="16"/>
+          <w:szCs w:val="16"/>
+        </w:rPr>
+        <w:t xml:space="preserve">      &lt;MENEE&gt;EA&lt;/MENEE&gt;</w:t>
+      </w:r>
+    </w:p>
+    <w:p>
+      <w:pPr>
+        <w:spacing w:after="0" w:line="240" w:lineRule="auto"/>
+      </w:pPr>
+      <w:r>
+        <w:rPr>
+          <w:rFonts w:ascii="Courier New" w:hAnsi="Courier New" w:cs="Courier New"/>
+          <w:sz w:val="16"/>
+          <w:szCs w:val="16"/>
+        </w:rPr>
+        <w:t xml:space="preserve">      &lt;ZE1EDL24 SEGMENT="1" /&gt;</w:t>
+      </w:r>
+    </w:p>
+    <w:p>
+      <w:pPr>
+        <w:spacing w:after="0" w:line="240" w:lineRule="auto"/>
+      </w:pPr>
+      <w:r>
+        <w:rPr>
+          <w:rFonts w:ascii="Courier New" w:hAnsi="Courier New" w:cs="Courier New"/>
+          <w:sz w:val="16"/>
+          <w:szCs w:val="16"/>
+        </w:rPr>
+        <w:t xml:space="preserve">      &lt;E1EDP02 SEGMENT="1"&gt;</w:t>
+      </w:r>
+    </w:p>
+    <w:p>
+      <w:pPr>
+        <w:spacing w:after="0" w:line="240" w:lineRule="auto"/>
+      </w:pPr>
+      <w:r>
+        <w:rPr>
+          <w:rFonts w:ascii="Courier New" w:hAnsi="Courier New" w:cs="Courier New"/>
+          <w:sz w:val="16"/>
+          <w:szCs w:val="16"/>
+        </w:rPr>
+        <w:t xml:space="preserve">        &lt;QUALF&gt;001&lt;/QUALF&gt;</w:t>
+      </w:r>
+    </w:p>
+    <w:p>
+      <w:pPr>
+        <w:spacing w:after="0" w:line="240" w:lineRule="auto"/>
+      </w:pPr>
+      <w:r>
+        <w:rPr>
+          <w:rFonts w:ascii="Courier New" w:hAnsi="Courier New" w:cs="Courier New"/>
+          <w:sz w:val="16"/>
+          <w:szCs w:val="16"/>
+        </w:rPr>
+        <w:t xml:space="preserve">        &lt;ZEILE&gt;000000&lt;/ZEILE&gt;</w:t>
+      </w:r>
+    </w:p>
+    <w:p>
+      <w:pPr>
+        <w:spacing w:after="0" w:line="240" w:lineRule="auto"/>
+      </w:pPr>
+      <w:r>
+        <w:rPr>
+          <w:rFonts w:ascii="Courier New" w:hAnsi="Courier New" w:cs="Courier New"/>
+          <w:sz w:val="16"/>
+          <w:szCs w:val="16"/>
+        </w:rPr>
+        <w:t xml:space="preserve">      &lt;/E1EDP02&gt;</w:t>
+      </w:r>
+    </w:p>
+    <w:p>
+      <w:pPr>
+        <w:spacing w:after="0" w:line="240" w:lineRule="auto"/>
+      </w:pPr>
+      <w:r>
+        <w:rPr>
+          <w:rFonts w:ascii="Courier New" w:hAnsi="Courier New" w:cs="Courier New"/>
+          <w:sz w:val="16"/>
+          <w:szCs w:val="16"/>
+        </w:rPr>
+        <w:t xml:space="preserve">      &lt;E1EDP19 SEGMENT="1"&gt;</w:t>
+      </w:r>
+    </w:p>
+    <w:p>
+      <w:pPr>
+        <w:spacing w:after="0" w:line="240" w:lineRule="auto"/>
+      </w:pPr>
+      <w:r>
+        <w:rPr>
+          <w:rFonts w:ascii="Courier New" w:hAnsi="Courier New" w:cs="Courier New"/>
+          <w:sz w:val="16"/>
+          <w:szCs w:val="16"/>
+        </w:rPr>
+        <w:t xml:space="preserve">        &lt;QUALF&gt;002&lt;/QUALF&gt;</w:t>
+      </w:r>
+    </w:p>
+    <w:p>
+      <w:pPr>
+        <w:spacing w:after="0" w:line="240" w:lineRule="auto"/>
+      </w:pPr>
+      <w:r>
+        <w:rPr>
+          <w:rFonts w:ascii="Courier New" w:hAnsi="Courier New" w:cs="Courier New"/>
+          <w:sz w:val="16"/>
+          <w:szCs w:val="16"/>
+        </w:rPr>
+        <w:t xml:space="preserve">        &lt;IDTNR&gt;SERVICES&lt;/IDTNR&gt;</w:t>
+      </w:r>
+    </w:p>
+    <w:p>
+      <w:pPr>
+        <w:spacing w:after="0" w:line="240" w:lineRule="auto"/>
+      </w:pPr>
+      <w:r>
+        <w:rPr>
+          <w:rFonts w:ascii="Courier New" w:hAnsi="Courier New" w:cs="Courier New"/>
+          <w:sz w:val="16"/>
+          <w:szCs w:val="16"/>
+        </w:rPr>
+        <w:t xml:space="preserve">        &lt;KTEXT&gt;Sanofi - Alzheimer's Disease Summit 2026&lt;/KTEXT&gt;</w:t>
+      </w:r>
+    </w:p>
+    <w:p>
+      <w:pPr>
+        <w:spacing w:after="0" w:line="240" w:lineRule="auto"/>
+      </w:pPr>
+      <w:r>
+        <w:rPr>
+          <w:rFonts w:ascii="Courier New" w:hAnsi="Courier New" w:cs="Courier New"/>
+          <w:sz w:val="16"/>
+          <w:szCs w:val="16"/>
+        </w:rPr>
+        <w:t xml:space="preserve">      &lt;/E1EDP19&gt;</w:t>
+      </w:r>
+    </w:p>
+    <w:p>
+      <w:pPr>
+        <w:spacing w:after="0" w:line="240" w:lineRule="auto"/>
+      </w:pPr>
+      <w:r>
+        <w:rPr>
+          <w:rFonts w:ascii="Courier New" w:hAnsi="Courier New" w:cs="Courier New"/>
+          <w:sz w:val="16"/>
+          <w:szCs w:val="16"/>
+        </w:rPr>
+        <w:t xml:space="preserve">      &lt;E1EDP26 SEGMENT="1"&gt;</w:t>
+      </w:r>
+    </w:p>
+    <w:p>
+      <w:pPr>
+        <w:spacing w:after="0" w:line="240" w:lineRule="auto"/>
+      </w:pPr>
+      <w:r>
+        <w:rPr>
+          <w:rFonts w:ascii="Courier New" w:hAnsi="Courier New" w:cs="Courier New"/>
+          <w:sz w:val="16"/>
+          <w:szCs w:val="16"/>
+        </w:rPr>
+        <w:t xml:space="preserve">        &lt;QUALF&gt;003&lt;/QUALF&gt;</w:t>
+      </w:r>
+    </w:p>
+    <w:p>
+      <w:pPr>
+        <w:spacing w:after="0" w:line="240" w:lineRule="auto"/>
+      </w:pPr>
+      <w:r>
+        <w:rPr>
+          <w:rFonts w:ascii="Courier New" w:hAnsi="Courier New" w:cs="Courier New"/>
+          <w:sz w:val="16"/>
+          <w:szCs w:val="16"/>
+        </w:rPr>
+        <w:t xml:space="preserve">        &lt;BETRG&gt;39462.32&lt;/BETRG&gt;</w:t>
+      </w:r>
+    </w:p>
+    <w:p>
+      <w:pPr>
+        <w:spacing w:after="0" w:line="240" w:lineRule="auto"/>
+      </w:pPr>
+      <w:r>
+        <w:rPr>
+          <w:rFonts w:ascii="Courier New" w:hAnsi="Courier New" w:cs="Courier New"/>
+          <w:sz w:val="16"/>
+          <w:szCs w:val="16"/>
+        </w:rPr>
+        <w:t xml:space="preserve">      &lt;/E1EDP26&gt;</w:t>
+      </w:r>
+    </w:p>
+    <w:p>
+      <w:pPr>
+        <w:spacing w:after="0" w:line="240" w:lineRule="auto"/>
+      </w:pPr>
+      <w:r>
+        <w:rPr>
+          <w:rFonts w:ascii="Courier New" w:hAnsi="Courier New" w:cs="Courier New"/>
+          <w:sz w:val="16"/>
+          <w:szCs w:val="16"/>
+        </w:rPr>
+        <w:t xml:space="preserve">      &lt;E1EDP26 SEGMENT="1"&gt;</w:t>
+      </w:r>
+    </w:p>
+    <w:p>
+      <w:pPr>
+        <w:spacing w:after="0" w:line="240" w:lineRule="auto"/>
+      </w:pPr>
+      <w:r>
+        <w:rPr>
+          <w:rFonts w:ascii="Courier New" w:hAnsi="Courier New" w:cs="Courier New"/>
+          <w:sz w:val="16"/>
+          <w:szCs w:val="16"/>
+        </w:rPr>
+        <w:t xml:space="preserve">        &lt;QUALF&gt;002&lt;/QUALF&gt;</w:t>
+      </w:r>
+    </w:p>
+    <w:p>
+      <w:pPr>
+        <w:spacing w:after="0" w:line="240" w:lineRule="auto"/>
+      </w:pPr>
+      <w:r>
+        <w:rPr>
+          <w:rFonts w:ascii="Courier New" w:hAnsi="Courier New" w:cs="Courier New"/>
+          <w:sz w:val="16"/>
+          <w:szCs w:val="16"/>
+        </w:rPr>
+        <w:t xml:space="preserve">        &lt;BETRG&gt;39462.32&lt;/BETRG&gt;</w:t>
+      </w:r>
+    </w:p>
+    <w:p>
+      <w:pPr>
+        <w:spacing w:after="0" w:line="240" w:lineRule="auto"/>
+      </w:pPr>
+      <w:r>
+        <w:rPr>
+          <w:rFonts w:ascii="Courier New" w:hAnsi="Courier New" w:cs="Courier New"/>
+          <w:sz w:val="16"/>
+          <w:szCs w:val="16"/>
+        </w:rPr>
+        <w:t xml:space="preserve">      &lt;/E1EDP26&gt;</w:t>
+      </w:r>
+    </w:p>
+    <w:p>
+      <w:pPr>
+        <w:spacing w:after="0" w:line="240" w:lineRule="auto"/>
+      </w:pPr>
+      <w:r>
+        <w:rPr>
+          <w:rFonts w:ascii="Courier New" w:hAnsi="Courier New" w:cs="Courier New"/>
+          <w:sz w:val="16"/>
+          <w:szCs w:val="16"/>
+        </w:rPr>
+        <w:t xml:space="preserve">      &lt;E1EDP04 SEGMENT="1"&gt;</w:t>
+      </w:r>
+    </w:p>
+    <w:p>
+      <w:pPr>
+        <w:spacing w:after="0" w:line="240" w:lineRule="auto"/>
+      </w:pPr>
+      <w:r>
+        <w:rPr>
+          <w:rFonts w:ascii="Courier New" w:hAnsi="Courier New" w:cs="Courier New"/>
+          <w:sz w:val="16"/>
+          <w:szCs w:val="16"/>
+        </w:rPr>
+        <w:t xml:space="preserve">        &lt;MWSBT&gt;0.00&lt;/MWSBT&gt;</w:t>
+      </w:r>
+    </w:p>
+    <w:p>
+      <w:pPr>
+        <w:spacing w:after="0" w:line="240" w:lineRule="auto"/>
+      </w:pPr>
+      <w:r>
+        <w:rPr>
+          <w:rFonts w:ascii="Courier New" w:hAnsi="Courier New" w:cs="Courier New"/>
+          <w:sz w:val="16"/>
+          <w:szCs w:val="16"/>
+        </w:rPr>
+        <w:t xml:space="preserve">      &lt;/E1EDP04&gt;</w:t>
+      </w:r>
+    </w:p>
+    <w:p>
+      <w:pPr>
+        <w:spacing w:after="0" w:line="240" w:lineRule="auto"/>
+      </w:pPr>
+      <w:r>
+        <w:rPr>
+          <w:rFonts w:ascii="Courier New" w:hAnsi="Courier New" w:cs="Courier New"/>
+          <w:sz w:val="16"/>
+          <w:szCs w:val="16"/>
+        </w:rPr>
+        <w:t xml:space="preserve">    &lt;/E1EDP01&gt;</w:t>
+      </w:r>
+    </w:p>
+    <w:p>
+      <w:pPr>
+        <w:spacing w:after="0" w:line="240" w:lineRule="auto"/>
+      </w:pPr>
+      <w:r>
+        <w:rPr>
+          <w:rFonts w:ascii="Courier New" w:hAnsi="Courier New" w:cs="Courier New"/>
+          <w:sz w:val="16"/>
+          <w:szCs w:val="16"/>
+        </w:rPr>
+        <w:t xml:space="preserve">    &lt;E1EDS01 SEGMENT="1"&gt;</w:t>
+      </w:r>
+    </w:p>
+    <w:p>
+      <w:pPr>
+        <w:spacing w:after="0" w:line="240" w:lineRule="auto"/>
+      </w:pPr>
+      <w:r>
+        <w:rPr>
+          <w:rFonts w:ascii="Courier New" w:hAnsi="Courier New" w:cs="Courier New"/>
+          <w:sz w:val="16"/>
+          <w:szCs w:val="16"/>
+        </w:rPr>
+        <w:t xml:space="preserve">      &lt;SUMID&gt;002&lt;/SUMID&gt;</w:t>
+      </w:r>
+    </w:p>
+    <w:p>
+      <w:pPr>
+        <w:spacing w:after="0" w:line="240" w:lineRule="auto"/>
+      </w:pPr>
+      <w:r>
+        <w:rPr>
+          <w:rFonts w:ascii="Courier New" w:hAnsi="Courier New" w:cs="Courier New"/>
+          <w:sz w:val="16"/>
+          <w:szCs w:val="16"/>
+        </w:rPr>
+        <w:t xml:space="preserve">      &lt;SUMME&gt;39462.32&lt;/SUMME&gt;</w:t>
+      </w:r>
+    </w:p>
+    <w:p>
+      <w:pPr>
+        <w:spacing w:after="0" w:line="240" w:lineRule="auto"/>
+      </w:pPr>
+      <w:r>
+        <w:rPr>
+          <w:rFonts w:ascii="Courier New" w:hAnsi="Courier New" w:cs="Courier New"/>
+          <w:sz w:val="16"/>
+          <w:szCs w:val="16"/>
+        </w:rPr>
+        <w:t xml:space="preserve">    &lt;/E1EDS01&gt;</w:t>
+      </w:r>
+    </w:p>
+    <w:p>
+      <w:pPr>
+        <w:spacing w:after="0" w:line="240" w:lineRule="auto"/>
+      </w:pPr>
+      <w:r>
+        <w:rPr>
+          <w:rFonts w:ascii="Courier New" w:hAnsi="Courier New" w:cs="Courier New"/>
+          <w:sz w:val="16"/>
+          <w:szCs w:val="16"/>
+        </w:rPr>
+        <w:t xml:space="preserve">    &lt;E1EDS01 SEGMENT="1"&gt;</w:t>
+      </w:r>
+    </w:p>
+    <w:p>
+      <w:pPr>
+        <w:spacing w:after="0" w:line="240" w:lineRule="auto"/>
+      </w:pPr>
+      <w:r>
+        <w:rPr>
+          <w:rFonts w:ascii="Courier New" w:hAnsi="Courier New" w:cs="Courier New"/>
+          <w:sz w:val="16"/>
+          <w:szCs w:val="16"/>
+        </w:rPr>
+        <w:t xml:space="preserve">      &lt;SUMID&gt;003&lt;/SUMID&gt;</w:t>
+      </w:r>
+    </w:p>
+    <w:p>
+      <w:pPr>
+        <w:spacing w:after="0" w:line="240" w:lineRule="auto"/>
+      </w:pPr>
+      <w:r>
+        <w:rPr>
+          <w:rFonts w:ascii="Courier New" w:hAnsi="Courier New" w:cs="Courier New"/>
+          <w:sz w:val="16"/>
+          <w:szCs w:val="16"/>
+        </w:rPr>
+        <w:t xml:space="preserve">      &lt;SUMME&gt;39462.32&lt;/SUMME&gt;</w:t>
+      </w:r>
+    </w:p>
+    <w:p>
+      <w:pPr>
+        <w:spacing w:after="0" w:line="240" w:lineRule="auto"/>
+      </w:pPr>
+      <w:r>
+        <w:rPr>
+          <w:rFonts w:ascii="Courier New" w:hAnsi="Courier New" w:cs="Courier New"/>
+          <w:sz w:val="16"/>
+          <w:szCs w:val="16"/>
+        </w:rPr>
+        <w:t xml:space="preserve">    &lt;/E1EDS01&gt;</w:t>
+      </w:r>
+    </w:p>
+    <w:p>
+      <w:pPr>
+        <w:spacing w:after="0" w:line="240" w:lineRule="auto"/>
+      </w:pPr>
+      <w:r>
+        <w:rPr>
+          <w:rFonts w:ascii="Courier New" w:hAnsi="Courier New" w:cs="Courier New"/>
+          <w:sz w:val="16"/>
+          <w:szCs w:val="16"/>
+        </w:rPr>
+        <w:t xml:space="preserve">    &lt;E1EDS01 SEGMENT="1"&gt;</w:t>
+      </w:r>
+    </w:p>
+    <w:p>
+      <w:pPr>
+        <w:spacing w:after="0" w:line="240" w:lineRule="auto"/>
+      </w:pPr>
+      <w:r>
+        <w:rPr>
+          <w:rFonts w:ascii="Courier New" w:hAnsi="Courier New" w:cs="Courier New"/>
+          <w:sz w:val="16"/>
+          <w:szCs w:val="16"/>
+        </w:rPr>
+        <w:t xml:space="preserve">      &lt;SUMID&gt;010&lt;/SUMID&gt;</w:t>
+      </w:r>
+    </w:p>
+    <w:p>
+      <w:pPr>
+        <w:spacing w:after="0" w:line="240" w:lineRule="auto"/>
+      </w:pPr>
+      <w:r>
+        <w:rPr>
+          <w:rFonts w:ascii="Courier New" w:hAnsi="Courier New" w:cs="Courier New"/>
+          <w:sz w:val="16"/>
+          <w:szCs w:val="16"/>
+        </w:rPr>
+        <w:t xml:space="preserve">      &lt;SUMME&gt;39462.32&lt;/SUMME&gt;</w:t>
+      </w:r>
+    </w:p>
+    <w:p>
+      <w:pPr>
+        <w:spacing w:after="0" w:line="240" w:lineRule="auto"/>
+      </w:pPr>
+      <w:r>
+        <w:rPr>
+          <w:rFonts w:ascii="Courier New" w:hAnsi="Courier New" w:cs="Courier New"/>
+          <w:sz w:val="16"/>
+          <w:szCs w:val="16"/>
+        </w:rPr>
+        <w:t xml:space="preserve">    &lt;/E1EDS01&gt;</w:t>
       </w:r>
     </w:p>
     <w:p>

</xml_diff>